<commit_message>
Business owner approved: path B documents in place
The team approved the path B drafts. Old versions go to the archive, the
drafts move to their canonical names, the decision record becomes
doc-owner-role.md, approvals are logged, file-system-index and
session-state are updated, and copies wait in prd-update-inbox.

Co-Authored-By: Claude Opus 5.5 <noreply@anthropic.com>
</commit_message>
<xml_diff>
--- a/project-docs/doc-stakeholder-map.docx
+++ b/project-docs/doc-stakeholder-map.docx
@@ -3343,6 +3343,1282 @@
           <v:rect style="width:0.0pt;height:1.5pt" o:hr="t" o:hrstd="t" o:hralign="center" fillcolor="#A0A0A0" stroked="f"/>
         </w:pict>
       </w:r>
+      <w:r>
+        <w:rPr>
+          <w:rtl w:val="0"/>
+        </w:rPr>
+      </w:r>
+    </w:p>
+    <w:p>
+      <w:pPr>
+        <w:pStyle w:val="Heading2"/>
+        <w:keepNext w:val="0"/>
+        <w:keepLines w:val="0"/>
+        <w:bidi w:val="1"/>
+        <w:spacing w:after="80" w:lineRule="auto"/>
+        <w:rPr>
+          <w:b w:val="1"/>
+          <w:bCs w:val="1"/>
+          <w:sz w:val="34"/>
+          <w:szCs w:val="34"/>
+        </w:rPr>
+      </w:pPr>
+      <w:bookmarkStart w:colFirst="0" w:colLast="0" w:name="_6lb6dpse8m16" w:id="3"/>
+      <w:bookmarkEnd w:id="3"/>
+      <w:r>
+        <w:rPr>
+          <w:rtl w:val="0"/>
+        </w:rPr>
+        <w:t>3. בעל העסק</w:t>
+      </w:r>
+      <w:r>
+        <w:rPr>
+          <w:b w:val="1"/>
+          <w:bCs w:val="1"/>
+          <w:sz w:val="34"/>
+          <w:szCs w:val="34"/>
+          <w:rtl w:val="1"/>
+        </w:rPr>
+      </w:r>
+      <w:r>
+        <w:rPr>
+          <w:b w:val="1"/>
+          <w:bCs w:val="1"/>
+          <w:sz w:val="34"/>
+          <w:szCs w:val="34"/>
+          <w:rtl w:val="1"/>
+        </w:rPr>
+      </w:r>
+    </w:p>
+    <w:p>
+      <w:pPr>
+        <w:bidi w:val="1"/>
+        <w:spacing w:after="240" w:before="240" w:lineRule="auto"/>
+        <w:rPr/>
+      </w:pPr>
+      <w:r>
+        <w:rPr>
+          <w:b w:val="1"/>
+          <w:bCs w:val="1"/>
+          <w:rtl w:val="1"/>
+        </w:rPr>
+        <w:t>סוג: משתמש משני (מנהל)</w:t>
+        <w:br/>
+        <w:t>פרופיל: בעלים של סטודיו או חדר כושר עם כמה מאמנים, או מאמן עצמאי שהוא העסק כולו</w:t>
+      </w:r>
+      <w:r>
+        <w:rPr>
+          <w:b w:val="1"/>
+          <w:bCs w:val="1"/>
+          <w:rtl w:val="1"/>
+        </w:rPr>
+      </w:r>
+      <w:r>
+        <w:rPr>
+          <w:rtl w:val="0"/>
+        </w:rPr>
+      </w:r>
+      <w:r>
+        <w:rPr>
+          <w:rtl w:val="1"/>
+        </w:rPr>
+      </w:r>
+      <w:r>
+        <w:rPr>
+          <w:rtl w:val="1"/>
+        </w:rPr>
+      </w:r>
+      <w:r>
+        <w:rPr>
+          <w:rtl w:val="1"/>
+        </w:rPr>
+      </w:r>
+      <w:r>
+        <w:rPr>
+          <w:rtl w:val="1"/>
+        </w:rPr>
+      </w:r>
+      <w:r>
+        <w:rPr>
+          <w:rtl w:val="1"/>
+        </w:rPr>
+      </w:r>
+      <w:r>
+        <w:rPr>
+          <w:b w:val="1"/>
+          <w:bCs w:val="1"/>
+          <w:rtl w:val="1"/>
+        </w:rPr>
+      </w:r>
+      <w:r>
+        <w:rPr>
+          <w:b w:val="1"/>
+          <w:bCs w:val="1"/>
+          <w:rtl w:val="1"/>
+        </w:rPr>
+      </w:r>
+      <w:r>
+        <w:rPr>
+          <w:rtl w:val="0"/>
+        </w:rPr>
+      </w:r>
+      <w:r>
+        <w:rPr>
+          <w:rtl w:val="1"/>
+        </w:rPr>
+      </w:r>
+      <w:r>
+        <w:rPr>
+          <w:rtl w:val="1"/>
+        </w:rPr>
+      </w:r>
+      <w:r>
+        <w:rPr>
+          <w:rtl w:val="1"/>
+        </w:rPr>
+      </w:r>
+      <w:r>
+        <w:rPr>
+          <w:rtl w:val="1"/>
+        </w:rPr>
+      </w:r>
+      <w:r>
+        <w:rPr>
+          <w:rtl w:val="1"/>
+        </w:rPr>
+      </w:r>
+      <w:r>
+        <w:rPr>
+          <w:rtl w:val="1"/>
+        </w:rPr>
+      </w:r>
+      <w:r>
+        <w:rPr>
+          <w:rtl w:val="1"/>
+        </w:rPr>
+      </w:r>
+      <w:r>
+        <w:rPr>
+          <w:rtl w:val="1"/>
+        </w:rPr>
+      </w:r>
+      <w:r>
+        <w:rPr>
+          <w:rtl w:val="1"/>
+        </w:rPr>
+      </w:r>
+      <w:r>
+        <w:rPr>
+          <w:rtl w:val="1"/>
+        </w:rPr>
+      </w:r>
+      <w:r>
+        <w:rPr>
+          <w:rtl w:val="1"/>
+        </w:rPr>
+      </w:r>
+      <w:r>
+        <w:rPr>
+          <w:rtl w:val="1"/>
+        </w:rPr>
+      </w:r>
+      <w:r>
+        <w:rPr>
+          <w:rtl w:val="1"/>
+        </w:rPr>
+      </w:r>
+      <w:r>
+        <w:rPr>
+          <w:rtl w:val="1"/>
+        </w:rPr>
+      </w:r>
+    </w:p>
+    <w:p>
+      <w:pPr>
+        <w:bidi w:val="1"/>
+        <w:spacing w:after="240" w:before="240" w:lineRule="auto"/>
+        <w:rPr/>
+      </w:pPr>
+      <w:r>
+        <w:rPr>
+          <w:b w:val="1"/>
+          <w:bCs w:val="1"/>
+          <w:rtl w:val="1"/>
+        </w:rPr>
+        <w:t>למה אכפת לו: ההכנסות והגבייה, שימור המתאמנים, ומחיר ותנאים אחידים לכל המאמנים בעסק.</w:t>
+      </w:r>
+      <w:r>
+        <w:rPr>
+          <w:b w:val="1"/>
+          <w:bCs w:val="1"/>
+          <w:rtl w:val="1"/>
+        </w:rPr>
+      </w:r>
+      <w:r>
+        <w:rPr>
+          <w:b w:val="1"/>
+          <w:bCs w:val="1"/>
+          <w:rtl w:val="1"/>
+        </w:rPr>
+      </w:r>
+      <w:r>
+        <w:rPr>
+          <w:b w:val="1"/>
+          <w:bCs w:val="1"/>
+          <w:rtl w:val="1"/>
+        </w:rPr>
+      </w:r>
+      <w:r>
+        <w:rPr>
+          <w:b w:val="1"/>
+          <w:bCs w:val="1"/>
+          <w:rtl w:val="1"/>
+        </w:rPr>
+      </w:r>
+      <w:r>
+        <w:rPr>
+          <w:b w:val="1"/>
+          <w:bCs w:val="1"/>
+          <w:rtl w:val="1"/>
+        </w:rPr>
+      </w:r>
+      <w:r>
+        <w:rPr>
+          <w:rtl w:val="0"/>
+        </w:rPr>
+      </w:r>
+      <w:r>
+        <w:rPr>
+          <w:rtl w:val="1"/>
+        </w:rPr>
+      </w:r>
+      <w:r>
+        <w:rPr>
+          <w:rtl w:val="1"/>
+        </w:rPr>
+      </w:r>
+      <w:r>
+        <w:rPr>
+          <w:rtl w:val="1"/>
+        </w:rPr>
+      </w:r>
+      <w:r>
+        <w:rPr>
+          <w:rtl w:val="1"/>
+        </w:rPr>
+      </w:r>
+      <w:r>
+        <w:rPr>
+          <w:rtl w:val="1"/>
+        </w:rPr>
+      </w:r>
+      <w:r>
+        <w:rPr>
+          <w:rtl w:val="1"/>
+        </w:rPr>
+      </w:r>
+      <w:r>
+        <w:rPr>
+          <w:rtl w:val="1"/>
+        </w:rPr>
+      </w:r>
+      <w:r>
+        <w:rPr>
+          <w:rtl w:val="1"/>
+        </w:rPr>
+      </w:r>
+      <w:r>
+        <w:rPr>
+          <w:rtl w:val="1"/>
+        </w:rPr>
+      </w:r>
+      <w:r>
+        <w:rPr>
+          <w:rtl w:val="1"/>
+        </w:rPr>
+      </w:r>
+      <w:r>
+        <w:rPr>
+          <w:rtl w:val="1"/>
+        </w:rPr>
+      </w:r>
+      <w:r>
+        <w:rPr>
+          <w:rtl w:val="1"/>
+        </w:rPr>
+      </w:r>
+      <w:r>
+        <w:rPr>
+          <w:rtl w:val="1"/>
+        </w:rPr>
+      </w:r>
+      <w:r>
+        <w:rPr>
+          <w:rtl w:val="1"/>
+        </w:rPr>
+      </w:r>
+      <w:r>
+        <w:rPr>
+          <w:rtl w:val="1"/>
+        </w:rPr>
+      </w:r>
+      <w:r>
+        <w:rPr>
+          <w:rtl w:val="1"/>
+        </w:rPr>
+      </w:r>
+      <w:r>
+        <w:rPr>
+          <w:rtl w:val="1"/>
+        </w:rPr>
+      </w:r>
+      <w:r>
+        <w:rPr>
+          <w:rtl w:val="1"/>
+        </w:rPr>
+      </w:r>
+      <w:r>
+        <w:rPr>
+          <w:rtl w:val="1"/>
+        </w:rPr>
+      </w:r>
+      <w:r>
+        <w:rPr>
+          <w:rtl w:val="1"/>
+        </w:rPr>
+      </w:r>
+      <w:r>
+        <w:rPr>
+          <w:rtl w:val="1"/>
+        </w:rPr>
+      </w:r>
+      <w:r>
+        <w:rPr>
+          <w:rtl w:val="1"/>
+        </w:rPr>
+      </w:r>
+      <w:r>
+        <w:rPr>
+          <w:rtl w:val="1"/>
+        </w:rPr>
+      </w:r>
+      <w:r>
+        <w:rPr>
+          <w:rtl w:val="1"/>
+        </w:rPr>
+      </w:r>
+      <w:r>
+        <w:rPr>
+          <w:rtl w:val="1"/>
+        </w:rPr>
+      </w:r>
+    </w:p>
+    <w:p>
+      <w:pPr>
+        <w:bidi w:val="1"/>
+        <w:spacing w:after="240" w:before="240" w:lineRule="auto"/>
+        <w:rPr>
+          <w:b w:val="1"/>
+          <w:bCs w:val="1"/>
+        </w:rPr>
+      </w:pPr>
+      <w:r>
+        <w:rPr>
+          <w:b w:val="1"/>
+          <w:bCs w:val="1"/>
+          <w:rtl w:val="1"/>
+        </w:rPr>
+        <w:t>מה נחשב הצלחה בעיניו:</w:t>
+      </w:r>
+      <w:r>
+        <w:rPr>
+          <w:b w:val="1"/>
+          <w:bCs w:val="1"/>
+          <w:rtl w:val="1"/>
+        </w:rPr>
+      </w:r>
+      <w:r>
+        <w:rPr>
+          <w:b w:val="1"/>
+          <w:bCs w:val="1"/>
+          <w:rtl w:val="1"/>
+        </w:rPr>
+      </w:r>
+      <w:r>
+        <w:rPr>
+          <w:b w:val="1"/>
+          <w:bCs w:val="1"/>
+          <w:rtl w:val="1"/>
+        </w:rPr>
+      </w:r>
+      <w:r>
+        <w:rPr>
+          <w:b w:val="1"/>
+          <w:bCs w:val="1"/>
+          <w:rtl w:val="1"/>
+        </w:rPr>
+      </w:r>
+      <w:r>
+        <w:rPr>
+          <w:b w:val="1"/>
+          <w:bCs w:val="1"/>
+          <w:rtl w:val="1"/>
+        </w:rPr>
+      </w:r>
+      <w:r>
+        <w:rPr>
+          <w:b w:val="1"/>
+          <w:bCs w:val="1"/>
+          <w:rtl w:val="1"/>
+        </w:rPr>
+      </w:r>
+      <w:r>
+        <w:rPr>
+          <w:b w:val="1"/>
+          <w:bCs w:val="1"/>
+          <w:rtl w:val="1"/>
+        </w:rPr>
+      </w:r>
+    </w:p>
+    <w:p>
+      <w:pPr>
+        <w:numPr>
+          <w:ilvl w:val="0"/>
+          <w:numId w:val="3"/>
+        </w:numPr>
+        <w:bidi w:val="1"/>
+        <w:spacing w:after="0" w:afterAutospacing="0" w:before="240" w:lineRule="auto"/>
+        <w:ind w:left="720" w:hanging="360"/>
+      </w:pPr>
+      <w:r>
+        <w:rPr>
+          <w:rtl w:val="1"/>
+        </w:rPr>
+        <w:t>תמונת העסק במקום אחד, בלי לשאול כל מאמן</w:t>
+      </w:r>
+      <w:r>
+        <w:rPr>
+          <w:rtl w:val="1"/>
+        </w:rPr>
+      </w:r>
+      <w:r>
+        <w:rPr>
+          <w:rtl w:val="1"/>
+        </w:rPr>
+      </w:r>
+    </w:p>
+    <w:p>
+      <w:pPr>
+        <w:numPr>
+          <w:ilvl w:val="0"/>
+          <w:numId w:val="3"/>
+        </w:numPr>
+        <w:bidi w:val="1"/>
+        <w:spacing w:after="0" w:afterAutospacing="0" w:before="0" w:beforeAutospacing="0" w:lineRule="auto"/>
+        <w:ind w:left="720" w:hanging="360"/>
+      </w:pPr>
+      <w:r>
+        <w:rPr>
+          <w:rtl w:val="1"/>
+        </w:rPr>
+        <w:t>גבייה פתוחה שנראית מיד</w:t>
+      </w:r>
+      <w:r>
+        <w:rPr>
+          <w:rtl w:val="1"/>
+        </w:rPr>
+      </w:r>
+      <w:r>
+        <w:rPr>
+          <w:rtl w:val="1"/>
+        </w:rPr>
+      </w:r>
+    </w:p>
+    <w:p>
+      <w:pPr>
+        <w:numPr>
+          <w:ilvl w:val="0"/>
+          <w:numId w:val="3"/>
+        </w:numPr>
+        <w:bidi w:val="1"/>
+        <w:spacing w:after="0" w:afterAutospacing="0" w:before="0" w:beforeAutospacing="0" w:lineRule="auto"/>
+        <w:ind w:left="720" w:hanging="360"/>
+      </w:pPr>
+      <w:r>
+        <w:rPr>
+          <w:rtl w:val="1"/>
+        </w:rPr>
+        <w:t>מדדי השימור וההזנה של כל העסק</w:t>
+      </w:r>
+      <w:r>
+        <w:rPr>
+          <w:rtl w:val="1"/>
+        </w:rPr>
+      </w:r>
+      <w:r>
+        <w:rPr>
+          <w:rtl w:val="1"/>
+        </w:rPr>
+      </w:r>
+      <w:r>
+        <w:rPr>
+          <w:rtl w:val="1"/>
+        </w:rPr>
+      </w:r>
+      <w:r>
+        <w:rPr>
+          <w:rtl w:val="1"/>
+        </w:rPr>
+      </w:r>
+    </w:p>
+    <w:p>
+      <w:pPr>
+        <w:numPr>
+          <w:ilvl w:val="0"/>
+          <w:numId w:val="3"/>
+        </w:numPr>
+        <w:bidi w:val="1"/>
+        <w:spacing w:after="0" w:afterAutospacing="0" w:before="0" w:beforeAutospacing="0" w:lineRule="auto"/>
+        <w:ind w:left="720" w:hanging="360"/>
+      </w:pPr>
+      <w:r>
+        <w:rPr>
+          <w:rtl w:val="1"/>
+        </w:rPr>
+        <w:t>מאמנים חדשים מצטרפים בהזמנה, בלי הקמה ידנית</w:t>
+      </w:r>
+      <w:r>
+        <w:rPr>
+          <w:rtl w:val="1"/>
+        </w:rPr>
+      </w:r>
+      <w:r>
+        <w:rPr>
+          <w:rtl w:val="1"/>
+        </w:rPr>
+      </w:r>
+      <w:r>
+        <w:rPr>
+          <w:rtl w:val="1"/>
+        </w:rPr>
+      </w:r>
+      <w:r>
+        <w:rPr>
+          <w:rtl w:val="1"/>
+        </w:rPr>
+      </w:r>
+      <w:r>
+        <w:rPr>
+          <w:rtl w:val="1"/>
+        </w:rPr>
+      </w:r>
+      <w:r>
+        <w:rPr>
+          <w:rtl w:val="1"/>
+        </w:rPr>
+      </w:r>
+      <w:r>
+        <w:rPr>
+          <w:rtl w:val="1"/>
+        </w:rPr>
+      </w:r>
+      <w:r>
+        <w:rPr>
+          <w:rtl w:val="1"/>
+        </w:rPr>
+      </w:r>
+      <w:r>
+        <w:rPr>
+          <w:rtl w:val="1"/>
+        </w:rPr>
+      </w:r>
+      <w:r>
+        <w:rPr>
+          <w:rtl w:val="1"/>
+        </w:rPr>
+      </w:r>
+      <w:r>
+        <w:rPr>
+          <w:rtl w:val="1"/>
+        </w:rPr>
+      </w:r>
+      <w:r>
+        <w:rPr>
+          <w:rtl w:val="1"/>
+        </w:rPr>
+      </w:r>
+    </w:p>
+    <w:p>
+      <w:pPr>
+        <w:bidi w:val="1"/>
+        <w:spacing w:after="240" w:before="240" w:lineRule="auto"/>
+        <w:rPr>
+          <w:b w:val="1"/>
+          <w:bCs w:val="1"/>
+        </w:rPr>
+      </w:pPr>
+      <w:r>
+        <w:rPr>
+          <w:b w:val="1"/>
+          <w:bCs w:val="1"/>
+          <w:rtl w:val="1"/>
+        </w:rPr>
+        <w:t>מה נחשב כישלון בעיניו:</w:t>
+      </w:r>
+      <w:r>
+        <w:rPr>
+          <w:b w:val="1"/>
+          <w:bCs w:val="1"/>
+          <w:rtl w:val="1"/>
+        </w:rPr>
+      </w:r>
+      <w:r>
+        <w:rPr>
+          <w:b w:val="1"/>
+          <w:bCs w:val="1"/>
+          <w:rtl w:val="1"/>
+        </w:rPr>
+      </w:r>
+      <w:r>
+        <w:rPr>
+          <w:b w:val="1"/>
+          <w:bCs w:val="1"/>
+          <w:rtl w:val="1"/>
+        </w:rPr>
+      </w:r>
+      <w:r>
+        <w:rPr>
+          <w:b w:val="1"/>
+          <w:bCs w:val="1"/>
+          <w:rtl w:val="1"/>
+        </w:rPr>
+      </w:r>
+      <w:r>
+        <w:rPr>
+          <w:b w:val="1"/>
+          <w:bCs w:val="1"/>
+          <w:rtl w:val="1"/>
+        </w:rPr>
+      </w:r>
+      <w:r>
+        <w:rPr>
+          <w:b w:val="1"/>
+          <w:bCs w:val="1"/>
+          <w:rtl w:val="1"/>
+        </w:rPr>
+      </w:r>
+      <w:r>
+        <w:rPr>
+          <w:b w:val="1"/>
+          <w:bCs w:val="1"/>
+          <w:rtl w:val="1"/>
+        </w:rPr>
+      </w:r>
+    </w:p>
+    <w:p>
+      <w:pPr>
+        <w:numPr>
+          <w:ilvl w:val="0"/>
+          <w:numId w:val="1"/>
+        </w:numPr>
+        <w:bidi w:val="1"/>
+        <w:spacing w:after="0" w:afterAutospacing="0" w:before="240" w:lineRule="auto"/>
+        <w:ind w:left="720" w:hanging="360"/>
+      </w:pPr>
+      <w:r>
+        <w:rPr>
+          <w:rtl w:val="1"/>
+        </w:rPr>
+        <w:t>נתונים מפוזרים אצל כל מאמן</w:t>
+      </w:r>
+      <w:r>
+        <w:rPr>
+          <w:rtl w:val="1"/>
+        </w:rPr>
+      </w:r>
+      <w:r>
+        <w:rPr>
+          <w:rtl w:val="1"/>
+        </w:rPr>
+      </w:r>
+      <w:r>
+        <w:rPr>
+          <w:rtl w:val="1"/>
+        </w:rPr>
+      </w:r>
+      <w:r>
+        <w:rPr>
+          <w:rtl w:val="1"/>
+        </w:rPr>
+      </w:r>
+      <w:r>
+        <w:rPr>
+          <w:rtl w:val="1"/>
+        </w:rPr>
+      </w:r>
+      <w:r>
+        <w:rPr>
+          <w:rtl w:val="1"/>
+        </w:rPr>
+      </w:r>
+      <w:r>
+        <w:rPr>
+          <w:rtl w:val="1"/>
+        </w:rPr>
+      </w:r>
+      <w:r>
+        <w:rPr>
+          <w:rtl w:val="1"/>
+        </w:rPr>
+      </w:r>
+      <w:r>
+        <w:rPr>
+          <w:rtl w:val="1"/>
+        </w:rPr>
+      </w:r>
+      <w:r>
+        <w:rPr>
+          <w:rtl w:val="1"/>
+        </w:rPr>
+      </w:r>
+    </w:p>
+    <w:p>
+      <w:pPr>
+        <w:numPr>
+          <w:ilvl w:val="0"/>
+          <w:numId w:val="1"/>
+        </w:numPr>
+        <w:bidi w:val="1"/>
+        <w:spacing w:after="0" w:afterAutospacing="0" w:before="0" w:beforeAutospacing="0" w:lineRule="auto"/>
+        <w:ind w:left="720" w:hanging="360"/>
+      </w:pPr>
+      <w:r>
+        <w:rPr>
+          <w:rtl w:val="1"/>
+        </w:rPr>
+        <w:t>גבייה שאינה נראית</w:t>
+      </w:r>
+      <w:r>
+        <w:rPr>
+          <w:rtl w:val="1"/>
+        </w:rPr>
+      </w:r>
+      <w:r>
+        <w:rPr>
+          <w:rtl w:val="1"/>
+        </w:rPr>
+      </w:r>
+      <w:r>
+        <w:rPr>
+          <w:rtl w:val="1"/>
+        </w:rPr>
+      </w:r>
+      <w:r>
+        <w:rPr>
+          <w:rtl w:val="1"/>
+        </w:rPr>
+      </w:r>
+      <w:r>
+        <w:rPr>
+          <w:rtl w:val="1"/>
+        </w:rPr>
+      </w:r>
+      <w:r>
+        <w:rPr>
+          <w:rtl w:val="1"/>
+        </w:rPr>
+      </w:r>
+      <w:r>
+        <w:rPr>
+          <w:rtl w:val="1"/>
+        </w:rPr>
+      </w:r>
+      <w:r>
+        <w:rPr>
+          <w:rtl w:val="1"/>
+        </w:rPr>
+      </w:r>
+      <w:r>
+        <w:rPr>
+          <w:rtl w:val="1"/>
+        </w:rPr>
+      </w:r>
+      <w:r>
+        <w:rPr>
+          <w:rtl w:val="1"/>
+        </w:rPr>
+      </w:r>
+      <w:r>
+        <w:rPr>
+          <w:rtl w:val="1"/>
+        </w:rPr>
+      </w:r>
+      <w:r>
+        <w:rPr>
+          <w:rtl w:val="1"/>
+        </w:rPr>
+      </w:r>
+      <w:r>
+        <w:rPr>
+          <w:rtl w:val="1"/>
+        </w:rPr>
+      </w:r>
+      <w:r>
+        <w:rPr>
+          <w:rtl w:val="1"/>
+        </w:rPr>
+      </w:r>
+    </w:p>
+    <w:p>
+      <w:pPr>
+        <w:numPr>
+          <w:ilvl w:val="0"/>
+          <w:numId w:val="1"/>
+        </w:numPr>
+        <w:bidi w:val="1"/>
+        <w:spacing w:after="240" w:before="0" w:beforeAutospacing="0" w:lineRule="auto"/>
+        <w:ind w:left="720" w:hanging="360"/>
+      </w:pPr>
+      <w:r>
+        <w:rPr>
+          <w:rtl w:val="1"/>
+        </w:rPr>
+        <w:t>מאמנים שאינם משתמשים באפליקציה</w:t>
+      </w:r>
+      <w:r>
+        <w:rPr>
+          <w:rtl w:val="1"/>
+        </w:rPr>
+      </w:r>
+      <w:r>
+        <w:rPr>
+          <w:rtl w:val="1"/>
+        </w:rPr>
+      </w:r>
+      <w:r>
+        <w:rPr>
+          <w:rtl w:val="1"/>
+        </w:rPr>
+      </w:r>
+      <w:r>
+        <w:rPr>
+          <w:rtl w:val="1"/>
+        </w:rPr>
+      </w:r>
+      <w:r>
+        <w:rPr>
+          <w:rtl w:val="1"/>
+        </w:rPr>
+      </w:r>
+      <w:r>
+        <w:rPr>
+          <w:rtl w:val="1"/>
+        </w:rPr>
+      </w:r>
+    </w:p>
+    <w:p>
+      <w:pPr>
+        <w:bidi w:val="1"/>
+        <w:spacing w:after="240" w:before="240" w:lineRule="auto"/>
+        <w:rPr/>
+      </w:pPr>
+      <w:r>
+        <w:rPr>
+          <w:b w:val="1"/>
+          <w:bCs w:val="1"/>
+          <w:rtl w:val="1"/>
+        </w:rPr>
+        <w:t>עוצמת השפעה: גבוהה (משלם) רמת עניין: בינונית</w:t>
+      </w:r>
+      <w:r>
+        <w:rPr>
+          <w:b w:val="1"/>
+          <w:bCs w:val="1"/>
+          <w:rtl w:val="1"/>
+        </w:rPr>
+      </w:r>
+      <w:r>
+        <w:rPr>
+          <w:b w:val="1"/>
+          <w:bCs w:val="1"/>
+          <w:rtl w:val="1"/>
+        </w:rPr>
+      </w:r>
+      <w:r>
+        <w:rPr>
+          <w:b w:val="1"/>
+          <w:bCs w:val="1"/>
+          <w:rtl w:val="1"/>
+        </w:rPr>
+      </w:r>
+      <w:r>
+        <w:rPr>
+          <w:rtl w:val="0"/>
+        </w:rPr>
+      </w:r>
+      <w:r>
+        <w:rPr>
+          <w:rtl w:val="1"/>
+        </w:rPr>
+      </w:r>
+      <w:r>
+        <w:rPr>
+          <w:rtl w:val="1"/>
+        </w:rPr>
+      </w:r>
+      <w:r>
+        <w:rPr>
+          <w:rtl w:val="1"/>
+        </w:rPr>
+      </w:r>
+      <w:r>
+        <w:rPr>
+          <w:b w:val="1"/>
+          <w:bCs w:val="1"/>
+          <w:rtl w:val="1"/>
+        </w:rPr>
+      </w:r>
+      <w:r>
+        <w:rPr>
+          <w:b w:val="1"/>
+          <w:bCs w:val="1"/>
+          <w:rtl w:val="1"/>
+        </w:rPr>
+      </w:r>
+      <w:r>
+        <w:rPr>
+          <w:b w:val="1"/>
+          <w:bCs w:val="1"/>
+          <w:rtl w:val="1"/>
+        </w:rPr>
+      </w:r>
+      <w:r>
+        <w:rPr>
+          <w:b w:val="1"/>
+          <w:bCs w:val="1"/>
+          <w:rtl w:val="1"/>
+        </w:rPr>
+      </w:r>
+      <w:r>
+        <w:rPr>
+          <w:rtl w:val="0"/>
+        </w:rPr>
+      </w:r>
+      <w:r>
+        <w:rPr>
+          <w:rtl w:val="1"/>
+        </w:rPr>
+      </w:r>
+      <w:r>
+        <w:rPr>
+          <w:rtl w:val="1"/>
+        </w:rPr>
+      </w:r>
+    </w:p>
+    <w:p>
+      <w:pPr>
+        <w:bidi w:val="1"/>
+        <w:spacing w:after="240" w:before="240" w:lineRule="auto"/>
+        <w:rPr/>
+      </w:pPr>
+      <w:r>
+        <w:rPr>
+          <w:b w:val="1"/>
+          <w:bCs w:val="1"/>
+          <w:rtl w:val="1"/>
+        </w:rPr>
+        <w:t>איך לנהל את הקשר: לשמור על שביעות רצון, ועדכון תקופתי.</w:t>
+      </w:r>
+      <w:r>
+        <w:rPr>
+          <w:b w:val="1"/>
+          <w:bCs w:val="1"/>
+          <w:rtl w:val="1"/>
+        </w:rPr>
+      </w:r>
+      <w:r>
+        <w:rPr>
+          <w:b w:val="1"/>
+          <w:bCs w:val="1"/>
+          <w:rtl w:val="1"/>
+        </w:rPr>
+      </w:r>
+      <w:r>
+        <w:rPr>
+          <w:b w:val="1"/>
+          <w:bCs w:val="1"/>
+          <w:rtl w:val="1"/>
+        </w:rPr>
+      </w:r>
+      <w:r>
+        <w:rPr>
+          <w:b w:val="1"/>
+          <w:bCs w:val="1"/>
+          <w:rtl w:val="1"/>
+        </w:rPr>
+      </w:r>
+      <w:r>
+        <w:rPr>
+          <w:b w:val="1"/>
+          <w:bCs w:val="1"/>
+          <w:rtl w:val="1"/>
+        </w:rPr>
+      </w:r>
+      <w:r>
+        <w:rPr>
+          <w:b w:val="1"/>
+          <w:bCs w:val="1"/>
+          <w:rtl w:val="1"/>
+        </w:rPr>
+      </w:r>
+      <w:r>
+        <w:rPr>
+          <w:b w:val="1"/>
+          <w:bCs w:val="1"/>
+          <w:rtl w:val="1"/>
+        </w:rPr>
+      </w:r>
+      <w:r>
+        <w:rPr>
+          <w:rtl w:val="0"/>
+        </w:rPr>
+      </w:r>
+      <w:r>
+        <w:rPr>
+          <w:rtl w:val="1"/>
+        </w:rPr>
+      </w:r>
+      <w:r>
+        <w:rPr>
+          <w:rtl w:val="1"/>
+        </w:rPr>
+      </w:r>
+      <w:r>
+        <w:rPr>
+          <w:rtl w:val="1"/>
+        </w:rPr>
+      </w:r>
+      <w:r>
+        <w:rPr>
+          <w:rtl w:val="1"/>
+        </w:rPr>
+      </w:r>
+      <w:r>
+        <w:rPr>
+          <w:rtl w:val="1"/>
+        </w:rPr>
+      </w:r>
+      <w:r>
+        <w:rPr>
+          <w:rtl w:val="1"/>
+        </w:rPr>
+      </w:r>
+      <w:r>
+        <w:rPr>
+          <w:rtl w:val="1"/>
+        </w:rPr>
+      </w:r>
+      <w:r>
+        <w:rPr>
+          <w:rtl w:val="1"/>
+        </w:rPr>
+      </w:r>
+      <w:r>
+        <w:rPr>
+          <w:rtl w:val="1"/>
+        </w:rPr>
+      </w:r>
+      <w:r>
+        <w:rPr>
+          <w:rtl w:val="1"/>
+        </w:rPr>
+      </w:r>
+      <w:r>
+        <w:rPr>
+          <w:rtl w:val="1"/>
+        </w:rPr>
+      </w:r>
+      <w:r>
+        <w:rPr>
+          <w:rtl w:val="1"/>
+        </w:rPr>
+      </w:r>
+      <w:r>
+        <w:rPr>
+          <w:rtl w:val="1"/>
+        </w:rPr>
+      </w:r>
+      <w:r>
+        <w:rPr>
+          <w:rtl w:val="1"/>
+        </w:rPr>
+      </w:r>
+      <w:r>
+        <w:rPr>
+          <w:rtl w:val="1"/>
+        </w:rPr>
+      </w:r>
+      <w:r>
+        <w:rPr>
+          <w:rtl w:val="1"/>
+        </w:rPr>
+      </w:r>
+      <w:r>
+        <w:rPr>
+          <w:rtl w:val="1"/>
+        </w:rPr>
+      </w:r>
+      <w:r>
+        <w:rPr>
+          <w:rtl w:val="1"/>
+        </w:rPr>
+      </w:r>
+      <w:r>
+        <w:rPr>
+          <w:rtl w:val="1"/>
+        </w:rPr>
+      </w:r>
+      <w:r>
+        <w:rPr>
+          <w:rtl w:val="1"/>
+        </w:rPr>
+      </w:r>
+      <w:r>
+        <w:rPr>
+          <w:rtl w:val="1"/>
+        </w:rPr>
+      </w:r>
+      <w:r>
+        <w:rPr>
+          <w:rtl w:val="1"/>
+        </w:rPr>
+      </w:r>
+      <w:r>
+        <w:rPr>
+          <w:rtl w:val="1"/>
+        </w:rPr>
+      </w:r>
+      <w:r>
+        <w:rPr>
+          <w:rtl w:val="1"/>
+        </w:rPr>
+      </w:r>
+      <w:r>
+        <w:rPr>
+          <w:rtl w:val="1"/>
+        </w:rPr>
+      </w:r>
+      <w:r>
+        <w:rPr>
+          <w:rtl w:val="1"/>
+        </w:rPr>
+      </w:r>
+      <w:r>
+        <w:rPr>
+          <w:rtl w:val="1"/>
+        </w:rPr>
+      </w:r>
+      <w:r>
+        <w:rPr>
+          <w:rtl w:val="1"/>
+        </w:rPr>
+      </w:r>
+      <w:r>
+        <w:rPr>
+          <w:rtl w:val="1"/>
+        </w:rPr>
+      </w:r>
+      <w:r>
+        <w:rPr>
+          <w:rtl w:val="1"/>
+        </w:rPr>
+      </w:r>
+      <w:r>
+        <w:rPr>
+          <w:rtl w:val="1"/>
+        </w:rPr>
+      </w:r>
+      <w:r>
+        <w:rPr>
+          <w:rtl w:val="1"/>
+        </w:rPr>
+      </w:r>
+      <w:r>
+        <w:rPr>
+          <w:rtl w:val="1"/>
+        </w:rPr>
+      </w:r>
+      <w:r>
+        <w:rPr>
+          <w:rtl w:val="1"/>
+        </w:rPr>
+      </w:r>
+      <w:r>
+        <w:rPr>
+          <w:rtl w:val="1"/>
+        </w:rPr>
+      </w:r>
+      <w:r>
+        <w:rPr>
+          <w:rtl w:val="1"/>
+        </w:rPr>
+      </w:r>
+      <w:r>
+        <w:rPr>
+          <w:rtl w:val="1"/>
+        </w:rPr>
+      </w:r>
+      <w:r>
+        <w:rPr>
+          <w:rtl w:val="1"/>
+        </w:rPr>
+      </w:r>
+      <w:r>
+        <w:rPr>
+          <w:rtl w:val="1"/>
+        </w:rPr>
+      </w:r>
+      <w:r>
+        <w:rPr>
+          <w:rtl w:val="1"/>
+        </w:rPr>
+      </w:r>
+      <w:r>
+        <w:rPr>
+          <w:rtl w:val="1"/>
+        </w:rPr>
+      </w:r>
+      <w:r>
+        <w:rPr>
+          <w:rtl w:val="1"/>
+        </w:rPr>
+      </w:r>
+      <w:r>
+        <w:rPr>
+          <w:rtl w:val="1"/>
+        </w:rPr>
+      </w:r>
+      <w:r>
+        <w:rPr>
+          <w:rtl w:val="1"/>
+        </w:rPr>
+      </w:r>
+      <w:r>
+        <w:rPr>
+          <w:rtl w:val="1"/>
+        </w:rPr>
+      </w:r>
+      <w:r>
+        <w:rPr>
+          <w:rtl w:val="1"/>
+        </w:rPr>
+      </w:r>
+      <w:r>
+        <w:rPr>
+          <w:rtl w:val="1"/>
+        </w:rPr>
+      </w:r>
+      <w:r/>
       <w:r>
         <w:rPr>
           <w:rtl w:val="0"/>
@@ -3570,15 +4846,8 @@
             <w:vAlign w:val="top"/>
           </w:tcPr>
           <w:p>
-            <w:pPr>
-              <w:bidi w:val="1"/>
-              <w:jc w:val="center"/>
-              <w:rPr/>
-            </w:pPr>
             <w:r>
-              <w:rPr>
-                <w:rtl w:val="0"/>
-              </w:rPr>
+              <w:t>עניין בינוני</w:t>
             </w:r>
           </w:p>
         </w:tc>
@@ -3715,14 +4984,8 @@
             <w:vAlign w:val="top"/>
           </w:tcPr>
           <w:p>
-            <w:pPr>
-              <w:bidi w:val="1"/>
-              <w:rPr/>
-            </w:pPr>
             <w:r>
-              <w:rPr>
-                <w:rtl w:val="0"/>
-              </w:rPr>
+              <w:t>בעל העסק</w:t>
             </w:r>
           </w:p>
         </w:tc>

</xml_diff>